<commit_message>
file2 changed by user2
</commit_message>
<xml_diff>
--- a/file2.docx
+++ b/file2.docx
@@ -12,16 +12,8 @@
         <w:rPr>
           <w:lang w:val="en-US"/>
         </w:rPr>
-        <w:t xml:space="preserve">It’s a new world </w:t>
+        <w:t>It’s a new world here !!!</w:t>
       </w:r>
-      <w:proofErr w:type="gramStart"/>
-      <w:r>
-        <w:rPr>
-          <w:lang w:val="en-US"/>
-        </w:rPr>
-        <w:t>here !!!</w:t>
-      </w:r>
-      <w:proofErr w:type="gramEnd"/>
     </w:p>
     <w:p>
       <w:pPr>
@@ -49,8 +41,21 @@
           <w:lang w:val="en-US"/>
         </w:rPr>
       </w:pPr>
+      <w:r>
+        <w:rPr>
+          <w:lang w:val="en-US"/>
+        </w:rPr>
+        <w:t>Another line from user2</w:t>
+      </w:r>
       <w:bookmarkStart w:id="0" w:name="_GoBack"/>
       <w:bookmarkEnd w:id="0"/>
+    </w:p>
+    <w:p>
+      <w:pPr>
+        <w:rPr>
+          <w:lang w:val="en-US"/>
+        </w:rPr>
+      </w:pPr>
     </w:p>
     <w:sectPr>
       <w:pgSz w:w="11906" w:h="16838"/>

</xml_diff>